<commit_message>
Bereitstellung über Netzlaufwerk: Startdatei, README, Backlog
- deploy/MPP-Tool starten.cmd: spiegelt dist/mpptool-gui nach
  %LOCALAPPDATA%\mpptool\app (erst komplett, danach nur Änderungen) und
  startet lokal; ein Direktstart vom Netzlaufwerk war über VPN nach
  5 Minuten noch nicht offen, über die Startdatei 3 Minuten beim ersten
  und ca. 10 s bei jedem weiteren Start.
- .gitattributes: .cmd/.ps1 mit CRLF.
- README: Abschnitt zur Bereitstellung, Backlog nachgetragen.

Co-Authored-By: Claude Opus 5.5 <noreply@anthropic.com>
</commit_message>
<xml_diff>
--- a/docs/Backlog_MPP_Auswertungstool.docx
+++ b/docs/Backlog_MPP_Auswertungstool.docx
@@ -926,6 +926,75 @@
     </w:p>
     <w:p>
       <w:pPr>
+        <w:numPr>
+          <w:ilvl w:val="0"/>
+          <w:numId w:val="1003"/>
+        </w:numPr>
+        <w:pStyle w:val="Compact"/>
+      </w:pPr>
+      <w:r>
+        <w:t xml:space="preserve">Ausführbare Anwendung gebaut (</w:t>
+      </w:r>
+      <w:r>
+        <w:rPr>
+          <w:rStyle w:val="VerbatimChar"/>
+        </w:rPr>
+        <w:t xml:space="preserve">build.ps1</w:t>
+      </w:r>
+      <w:r>
+        <w:t xml:space="preserve">, inkl. portabler Java-Laufzeit) und auf K: bereitgestellt: Ordner </w:t>
+      </w:r>
+      <w:r>
+        <w:rPr>
+          <w:rStyle w:val="VerbatimChar"/>
+        </w:rPr>
+        <w:t xml:space="preserve">mpptool-gui</w:t>
+      </w:r>
+      <w:r>
+        <w:t xml:space="preserve"> plus Startdatei </w:t>
+      </w:r>
+      <w:r>
+        <w:rPr>
+          <w:rStyle w:val="VerbatimChar"/>
+        </w:rPr>
+        <w:t xml:space="preserve">MPP-Tool starten.cmd</w:t>
+      </w:r>
+      <w:r>
+        <w:t xml:space="preserve">, die die Anwendung nach %LOCALAPPDATA% spiegelt und lokal startet (Direktstart vom Netzlaufwerk war über die langsame Verbindung nach 5 Minuten noch nicht offen). </w:t>
+      </w:r>
+      <w:r>
+        <w:rPr>
+          <w:rStyle w:val="VerbatimChar"/>
+        </w:rPr>
+        <w:t xml:space="preserve">build.ps1</w:t>
+      </w:r>
+      <w:r>
+        <w:t xml:space="preserve"> lief unter Windows PowerShell 5.1 wegen fehlender UTF-8-BOM nicht – behoben</w:t>
+      </w:r>
+    </w:p>
+    <w:p>
+      <w:pPr>
+        <w:numPr>
+          <w:ilvl w:val="0"/>
+          <w:numId w:val="1003"/>
+        </w:numPr>
+        <w:pStyle w:val="Compact"/>
+      </w:pPr>
+      <w:r>
+        <w:t xml:space="preserve">Backlog liegt jetzt im Repo unter </w:t>
+      </w:r>
+      <w:r>
+        <w:rPr>
+          <w:rStyle w:val="VerbatimChar"/>
+        </w:rPr>
+        <w:t xml:space="preserve">docs/</w:t>
+      </w:r>
+      <w:r>
+        <w:t xml:space="preserve"> (führende Fassung, wird mit dem Code versioniert); alle Änderungen committet und nach GitHub gepusht</w:t>
+      </w:r>
+    </w:p>
+    <w:p>
+      <w:pPr>
         <w:pStyle w:val="Heading2"/>
       </w:pPr>
       <w:r>
@@ -1034,7 +1103,16 @@
         <w:t xml:space="preserve">C:\Test\PM_Tool\mpp-tool</w:t>
       </w:r>
       <w:r>
-        <w:t xml:space="preserve">; Änderungen vom 13.09. (Diagramm-Layout) und 02.10. noch nicht committet</w:t>
+        <w:t xml:space="preserve"> – führender Stand inkl. Backlog (</w:t>
+      </w:r>
+      <w:r>
+        <w:rPr>
+          <w:rStyle w:val="VerbatimChar"/>
+        </w:rPr>
+        <w:t xml:space="preserve">docs/</w:t>
+      </w:r>
+      <w:r>
+        <w:t xml:space="preserve">); Kopie für den Auftraggeber auf K:</w:t>
       </w:r>
     </w:p>
     <w:p>
@@ -1076,7 +1154,16 @@
         <w:t xml:space="preserve">build.ps1</w:t>
       </w:r>
       <w:r>
-        <w:t xml:space="preserve">, siehe ADR-001, Bedingung/Risiko)</w:t>
+        <w:t xml:space="preserve">, siehe ADR-001, Bedingung/Risiko) → .exe läuft auf dem eigenen Rechner; Test auf einem Rechner der Fachabteilungen (Kollege, Start über </w:t>
+      </w:r>
+      <w:r>
+        <w:rPr>
+          <w:rStyle w:val="VerbatimChar"/>
+        </w:rPr>
+        <w:t xml:space="preserve">MPP-Tool starten.cmd</w:t>
+      </w:r>
+      <w:r>
+        <w:t xml:space="preserve"> auf K:) inkl. Antivirus-/SmartScreen-Verhalten ausstehend</w:t>
       </w:r>
     </w:p>
     <w:p>

</xml_diff>

<commit_message>
Master Timeline je KW mit Planlinie, KW-Zeitraum, Auswertungsdatum, Kopfzeile
Umsetzung der Besprechung zur Master-Timeline-Auswertung:
- Master Timeline je Kalenderwoche: blaue Linie = geplante Anzahl
  geschlossener Aufgaben, kumuliert nach aktuellem Plan bis Planende;
  grüne/graue Balken = tatsächlich geschlossen/überwacht nur in Wochen mit
  Snapshot; Auswertungswoche markiert (metrics.master_timeline,
  charts.draw_master_timeline ersetzt draw_timeline).
- GUI: Auswertungsdatum, Zeitraum KW von–bis (Standard erste Snapshot-KW
  bis Planende, live), horizontales Scrollen ab 60 Wochen, Kopfzeile mit
  Projekt/Timeline-Datei/Auswertungsdatum über der Vorschau.
- Export: Kopfzeile auf jeder PDF-/PPTX-Seite, Timeline-Datei auf der
  Titelfolie, Dateivorschlag <Projekt>_Review_KWnn_<Datum>.
- CLI: report --von/--bis.
- README und Backlog nachgezogen; 23 Tests.

Co-Authored-By: Claude Opus 5.5 <noreply@anthropic.com>
</commit_message>
<xml_diff>
--- a/docs/Backlog_MPP_Auswertungstool.docx
+++ b/docs/Backlog_MPP_Auswertungstool.docx
@@ -1239,6 +1239,92 @@
     </w:p>
     <w:p>
       <w:pPr>
+        <w:pStyle w:val="Heading3"/>
+      </w:pPr>
+      <w:r>
+        <w:t xml:space="preserve">5. Oktober 2026 – Master Timeline nach Besprechung umgesetzt</w:t>
+      </w:r>
+    </w:p>
+    <w:p>
+      <w:pPr>
+        <w:numPr>
+          <w:ilvl w:val="0"/>
+          <w:numId w:val="1003"/>
+        </w:numPr>
+        <w:pStyle w:val="Compact"/>
+      </w:pPr>
+      <w:r>
+        <w:t xml:space="preserve">Master Timeline je Kalenderwoche: blaue Linie = geplante Anzahl geschlossener Aufgaben (kumuliert, aktueller Plan = jüngster Snapshot, geplantes Ende, ohne Hold/Cancelled) bis Planende; grüne Balken = tatsächlich geschlossen, graue Balken = überwacht – nur in Wochen mit Snapshot; Auswertungswoche gestrichelt markiert</w:t>
+      </w:r>
+    </w:p>
+    <w:p>
+      <w:pPr>
+        <w:numPr>
+          <w:ilvl w:val="0"/>
+          <w:numId w:val="1003"/>
+        </w:numPr>
+        <w:pStyle w:val="Compact"/>
+      </w:pPr>
+      <w:r>
+        <w:t xml:space="preserve">Oberfläche: Auswertungsdatum (Standard heute) und Zeitraum „Timeline von–bis” (KW), Standard erste Snapshot-KW bis Planende, Zurücksetzen per Knopf; Vorschau aktualisiert sich live; ab 60 Wochen horizontal scrollbar</w:t>
+      </w:r>
+    </w:p>
+    <w:p>
+      <w:pPr>
+        <w:numPr>
+          <w:ilvl w:val="0"/>
+          <w:numId w:val="1003"/>
+        </w:numPr>
+        <w:pStyle w:val="Compact"/>
+      </w:pPr>
+      <w:r>
+        <w:t xml:space="preserve">Kopfzeile über der Vorschau und auf jeder PDF-/PPTX-Seite: Projekt, Timeline-Datei, Auswertungsdatum mit KW; Titelfolie mit Timeline-Datei; Export-Dateiname wird als </w:t>
+      </w:r>
+      <w:r>
+        <w:rPr>
+          <w:rStyle w:val="VerbatimChar"/>
+        </w:rPr>
+        <w:t xml:space="preserve">&lt;Projekt&gt;_Review_KWnn_&lt;Datum&gt;</w:t>
+      </w:r>
+      <w:r>
+        <w:t xml:space="preserve"> vorgeschlagen</w:t>
+      </w:r>
+    </w:p>
+    <w:p>
+      <w:pPr>
+        <w:numPr>
+          <w:ilvl w:val="0"/>
+          <w:numId w:val="1003"/>
+        </w:numPr>
+        <w:pStyle w:val="Compact"/>
+      </w:pPr>
+      <w:r>
+        <w:t xml:space="preserve">CLI: </w:t>
+      </w:r>
+      <w:r>
+        <w:rPr>
+          <w:rStyle w:val="VerbatimChar"/>
+        </w:rPr>
+        <w:t xml:space="preserve">report --von … --bis …</w:t>
+      </w:r>
+      <w:r>
+        <w:t xml:space="preserve">; 23 pytest-Tests grün</w:t>
+      </w:r>
+    </w:p>
+    <w:p>
+      <w:pPr>
+        <w:numPr>
+          <w:ilvl w:val="0"/>
+          <w:numId w:val="1003"/>
+        </w:numPr>
+        <w:pStyle w:val="Compact"/>
+      </w:pPr>
+      <w:r>
+        <w:t xml:space="preserve">Hinweis: Die blaue Planlinie nutzt den aktuellen Plan (geplantes Ende), der Erfüllungsgrad weiterhin das Basisplan-Ende – beide Werte stehen in der Statuszeile der Folie</w:t>
+      </w:r>
+    </w:p>
+    <w:p>
+      <w:pPr>
         <w:pStyle w:val="Heading2"/>
       </w:pPr>
       <w:r>
@@ -1449,7 +1535,13 @@
         <w:pStyle w:val="Compact"/>
       </w:pPr>
       <w:r>
-        <w:t xml:space="preserve">Master Timeline nach Besprechung umbauen: blaue Planlinie (geplante geschlossene Aufgaben je KW bis Planende, aus dem aktuellen Plan), grüne Ist-Balken bis zur Auswertungswoche</w:t>
+        <w:rPr>
+          <w:strike/>
+        </w:rPr>
+        <w:t xml:space="preserve">Master Timeline nach Besprechung umbauen</w:t>
+      </w:r>
+      <w:r>
+        <w:t xml:space="preserve"> → umgesetzt am 05.10.</w:t>
       </w:r>
     </w:p>
     <w:p>
@@ -1461,7 +1553,13 @@
         <w:pStyle w:val="Compact"/>
       </w:pPr>
       <w:r>
-        <w:t xml:space="preserve">Zeitraum-Auswahl KW von–bis in der Oberfläche (statt nur Snapshots ankreuzen); bei langen Projekten zusätzlich horizontales Scrollen bzw. Navigation in der Vorschau</w:t>
+        <w:rPr>
+          <w:strike/>
+        </w:rPr>
+        <w:t xml:space="preserve">Zeitraum-Auswahl KW von–bis, horizontales Scrollen bei langen Projekten</w:t>
+      </w:r>
+      <w:r>
+        <w:t xml:space="preserve"> → umgesetzt am 05.10.; offen: Bildschirmtest mit echtem mehrjährigem Projekt</w:t>
       </w:r>
     </w:p>
     <w:p>
@@ -1473,7 +1571,13 @@
         <w:pStyle w:val="Compact"/>
       </w:pPr>
       <w:r>
-        <w:t xml:space="preserve">Kopfzeile wie im Referenzbericht: Projekt, Timeline-Datei, Auswertungsdatum, Auswertungswoche – in Vorschau und Export</w:t>
+        <w:rPr>
+          <w:strike/>
+        </w:rPr>
+        <w:t xml:space="preserve">Kopfzeile wie im Referenzbericht</w:t>
+      </w:r>
+      <w:r>
+        <w:t xml:space="preserve"> → umgesetzt am 05.10.</w:t>
       </w:r>
     </w:p>
     <w:p>
@@ -1531,6 +1635,18 @@
       </w:pPr>
       <w:r>
         <w:t xml:space="preserve">Teilnehmer/Rollen der Besprechung und Verantwortliche für die TODOs festhalten (im Protokoll offen)</w:t>
+      </w:r>
+    </w:p>
+    <w:p>
+      <w:pPr>
+        <w:numPr>
+          <w:ilvl w:val="0"/>
+          <w:numId w:val="1004"/>
+        </w:numPr>
+        <w:pStyle w:val="Compact"/>
+      </w:pPr>
+      <w:r>
+        <w:t xml:space="preserve">Bestätigen, ob die Planlinie der Master Timeline den aktuellen Plan (geplantes Ende) oder den Basisplan verwenden soll (derzeit: aktueller Plan, Erfüllungsgrad: Basisplan)</w:t>
       </w:r>
     </w:p>
     <w:bookmarkEnd w:id="24"/>

</xml_diff>